<commit_message>
Rota inexistente devolve 404 e evidencias do teste com Oracle desligado
- GlobalExceptionHandler: NoResourceFoundException -> 404 (antes caia no
  handler generico e virava 500).
- Retestado no Docker: mvn test 11/11, endpoints /oracle/** ok com
  ORACLE_ENABLED=true; sem a variavel, /pedidos (H2) 200 e /oracle/** 404.

Co-Authored-By: Claude Opus 5.5 <noreply@anthropic.com>
Claude-Session: https://claude.ai/code/session_016yJGUzA7ayQQU9j3heGUMH
</commit_message>
<xml_diff>
--- a/docs/fase6/DOCUMENTACAO_FASE6.docx
+++ b/docs/fase6/DOCUMENTACAO_FASE6.docx
@@ -10106,6 +10106,123 @@
                 <w:szCs w:val="22"/>
               </w:rPr>
               <w:t xml:space="preserve">Pedido 999 → 404 • status inválido → 400 • sensor 99 → 404 • sem token → 403</w:t>
+            </w:r>
+          </w:p>
+        </w:tc>
+      </w:tr>
+      <w:tr>
+        <w:trPr>
+          <w:cantSplit/>
+          <w:tblHeader w:val="false"/>
+        </w:trPr>
+        <w:tc>
+          <w:tcPr>
+            <w:tcW w:type="dxa" w:w="3700"/>
+            <w:tcBorders>
+              <w:top w:val="single" w:color="D0D0D0" w:sz="4"/>
+              <w:left w:val="single" w:color="D0D0D0" w:sz="4"/>
+              <w:bottom w:val="single" w:color="D0D0D0" w:sz="4"/>
+              <w:right w:val="single" w:color="D0D0D0" w:sz="4"/>
+            </w:tcBorders>
+            <w:tcMar>
+              <w:top w:type="dxa" w:w="60"/>
+              <w:left w:type="dxa" w:w="100"/>
+              <w:bottom w:type="dxa" w:w="60"/>
+              <w:right w:type="dxa" w:w="100"/>
+            </w:tcMar>
+          </w:tcPr>
+          <w:p>
+            <w:pPr>
+              <w:spacing w:after="0" w:line="260"/>
+            </w:pPr>
+            <w:r>
+              <w:rPr>
+                <w:rFonts w:ascii="Calibri" w:cs="Calibri" w:eastAsia="Calibri" w:hAnsi="Calibri"/>
+                <w:sz w:val="22"/>
+                <w:szCs w:val="22"/>
+              </w:rPr>
+              <w:t xml:space="preserve">Sem </w:t>
+            </w:r>
+            <w:r>
+              <w:rPr>
+                <w:rFonts w:ascii="Consolas" w:cs="Consolas" w:eastAsia="Consolas" w:hAnsi="Consolas"/>
+                <w:color w:val="9B0A50"/>
+                <w:sz w:val="20"/>
+                <w:szCs w:val="20"/>
+              </w:rPr>
+              <w:t xml:space="preserve">ORACLE_ENABLED</w:t>
+            </w:r>
+            <w:r>
+              <w:rPr>
+                <w:rFonts w:ascii="Calibri" w:cs="Calibri" w:eastAsia="Calibri" w:hAnsi="Calibri"/>
+                <w:sz w:val="22"/>
+                <w:szCs w:val="22"/>
+              </w:rPr>
+              <w:t xml:space="preserve"> (padrão)</w:t>
+            </w:r>
+          </w:p>
+        </w:tc>
+        <w:tc>
+          <w:tcPr>
+            <w:tcW w:type="dxa" w:w="5326"/>
+            <w:tcBorders>
+              <w:top w:val="single" w:color="D0D0D0" w:sz="4"/>
+              <w:left w:val="single" w:color="D0D0D0" w:sz="4"/>
+              <w:bottom w:val="single" w:color="D0D0D0" w:sz="4"/>
+              <w:right w:val="single" w:color="D0D0D0" w:sz="4"/>
+            </w:tcBorders>
+            <w:tcMar>
+              <w:top w:type="dxa" w:w="60"/>
+              <w:left w:type="dxa" w:w="100"/>
+              <w:bottom w:type="dxa" w:w="60"/>
+              <w:right w:type="dxa" w:w="100"/>
+            </w:tcMar>
+          </w:tcPr>
+          <w:p>
+            <w:pPr>
+              <w:spacing w:after="0" w:line="260"/>
+            </w:pPr>
+            <w:r>
+              <w:rPr>
+                <w:rFonts w:ascii="Calibri" w:cs="Calibri" w:eastAsia="Calibri" w:hAnsi="Calibri"/>
+                <w:sz w:val="22"/>
+                <w:szCs w:val="22"/>
+              </w:rPr>
+              <w:t xml:space="preserve">Back-end sobe igual à Fase 5: login ok, </w:t>
+            </w:r>
+            <w:r>
+              <w:rPr>
+                <w:rFonts w:ascii="Consolas" w:cs="Consolas" w:eastAsia="Consolas" w:hAnsi="Consolas"/>
+                <w:color w:val="9B0A50"/>
+                <w:sz w:val="20"/>
+                <w:szCs w:val="20"/>
+              </w:rPr>
+              <w:t xml:space="preserve">/pedidos</w:t>
+            </w:r>
+            <w:r>
+              <w:rPr>
+                <w:rFonts w:ascii="Calibri" w:cs="Calibri" w:eastAsia="Calibri" w:hAnsi="Calibri"/>
+                <w:sz w:val="22"/>
+                <w:szCs w:val="22"/>
+              </w:rPr>
+              <w:t xml:space="preserve"> (H2) 200 e </w:t>
+            </w:r>
+            <w:r>
+              <w:rPr>
+                <w:rFonts w:ascii="Consolas" w:cs="Consolas" w:eastAsia="Consolas" w:hAnsi="Consolas"/>
+                <w:color w:val="9B0A50"/>
+                <w:sz w:val="20"/>
+                <w:szCs w:val="20"/>
+              </w:rPr>
+              <w:t xml:space="preserve">/oracle/**</w:t>
+            </w:r>
+            <w:r>
+              <w:rPr>
+                <w:rFonts w:ascii="Calibri" w:cs="Calibri" w:eastAsia="Calibri" w:hAnsi="Calibri"/>
+                <w:sz w:val="22"/>
+                <w:szCs w:val="22"/>
+              </w:rPr>
+              <w:t xml:space="preserve"> → 404</w:t>
             </w:r>
           </w:p>
         </w:tc>

</xml_diff>